<commit_message>
Fix final report Crystal Opt reference
</commit_message>
<xml_diff>
--- a/docs/FINAL_REPORT.docx
+++ b/docs/FINAL_REPORT.docx
@@ -16004,7 +16004,7 @@
         </w:numPr>
       </w:pPr>
       <w:r>
-        <w:t xml:space="preserve">Crystal GPU query implementation reference:</w:t>
+        <w:t xml:space="preserve">Crystal Opt GPU query implementation reference:</w:t>
       </w:r>
       <w:r>
         <w:t xml:space="preserve"> </w:t>
@@ -16013,7 +16013,7 @@
         <w:rPr>
           <w:rStyle w:val="VerbatimChar"/>
         </w:rPr>
-        <w:t xml:space="preserve">https://github.com/anilshanbhag/crystal</w:t>
+        <w:t xml:space="preserve">https://github.com/jiashenC/crystal-opt</w:t>
       </w:r>
     </w:p>
     <w:bookmarkEnd w:id="66"/>

</xml_diff>